<commit_message>
docs: finalize commercial product audit
</commit_message>
<xml_diff>
--- a/docs/caption-studio-commercial-product-audit.docx
+++ b/docs/caption-studio-commercial-product-audit.docx
@@ -2146,6 +2146,11 @@
       <w:pPr>
         <w:spacing w:after="0"/>
       </w:pPr>
+    </w:p>
+    <w:p>
+      <w:r>
+        <w:br w:type="page"/>
+      </w:r>
     </w:p>
     <w:p>
       <w:pPr>
@@ -4539,19 +4544,6 @@
       </w:pPr>
       <w:r>
         <w:t>Video transform is independent of canvas preset: fit/fill, normalized position, scale and free rotation.</w:t>
-      </w:r>
-    </w:p>
-    <w:p>
-      <w:pPr>
-        <w:pStyle w:val="ListBullet"/>
-      </w:pPr>
-      <w:r>
-        <w:t>Long jobs persist state and report stages; opening a project never retranscribes completed media.</w:t>
-      </w:r>
-    </w:p>
-    <w:p>
-      <w:r>
-        <w:br w:type="page"/>
       </w:r>
     </w:p>
     <w:p>
@@ -7804,47 +7796,6 @@
       </w:pPr>
     </w:p>
     <w:p>
-      <w:pPr>
-        <w:pStyle w:val="Heading1"/>
-        <w:keepNext/>
-      </w:pPr>
-      <w:r>
-        <w:t>Immediate next decisions</w:t>
-      </w:r>
-    </w:p>
-    <w:p>
-      <w:pPr>
-        <w:pStyle w:val="ListBullet"/>
-      </w:pPr>
-      <w:r>
-        <w:t>Approve the no-artificial-limits free baseline and defer paid SKU implementation until retention is measured.</w:t>
-      </w:r>
-    </w:p>
-    <w:p>
-      <w:pPr>
-        <w:pStyle w:val="ListBullet"/>
-      </w:pPr>
-      <w:r>
-        <w:t>Make Seeker tactile acceptance and rendered MP4 export the only two product-critical engineering priorities.</w:t>
-      </w:r>
-    </w:p>
-    <w:p>
-      <w:pPr>
-        <w:pStyle w:val="ListBullet"/>
-      </w:pPr>
-      <w:r>
-        <w:t>Recruit a small codec/device matrix before adding more styles or animations.</w:t>
-      </w:r>
-    </w:p>
-    <w:p>
-      <w:pPr>
-        <w:pStyle w:val="ListBullet"/>
-      </w:pPr>
-      <w:r>
-        <w:t>Publish the beta as explicitly pre-release: transcription/editor milestone, arm64 sideload, source available, no claim of store readiness.</w:t>
-      </w:r>
-    </w:p>
-    <w:p>
       <w:r>
         <w:br w:type="page"/>
       </w:r>

</xml_diff>